<commit_message>
📝 docs: generate final report
</commit_message>
<xml_diff>
--- a/final_report_real_estate.docx
+++ b/final_report_real_estate.docx
@@ -23,47 +23,7 @@
           <w:sz w:val="32"/>
           <w:szCs w:val="32"/>
         </w:rPr>
-        <w:t>Анализ влияния факторов на ценообразование на рынке недвижимости (</w:t>
-      </w:r>
-      <w:proofErr w:type="spellStart"/>
-      <w:r>
-        <w:rPr>
-          <w:rStyle w:val="a3"/>
-          <w:color w:val="0F1115"/>
-          <w:sz w:val="32"/>
-          <w:szCs w:val="32"/>
-        </w:rPr>
-        <w:t>Python</w:t>
-      </w:r>
-      <w:proofErr w:type="spellEnd"/>
-      <w:r>
-        <w:rPr>
-          <w:rStyle w:val="a3"/>
-          <w:color w:val="0F1115"/>
-          <w:sz w:val="32"/>
-          <w:szCs w:val="32"/>
-        </w:rPr>
-        <w:t xml:space="preserve">, </w:t>
-      </w:r>
-      <w:proofErr w:type="spellStart"/>
-      <w:r>
-        <w:rPr>
-          <w:rStyle w:val="a3"/>
-          <w:color w:val="0F1115"/>
-          <w:sz w:val="32"/>
-          <w:szCs w:val="32"/>
-        </w:rPr>
-        <w:t>Statsmodels</w:t>
-      </w:r>
-      <w:proofErr w:type="spellEnd"/>
-      <w:r>
-        <w:rPr>
-          <w:rStyle w:val="a3"/>
-          <w:color w:val="0F1115"/>
-          <w:sz w:val="32"/>
-          <w:szCs w:val="32"/>
-        </w:rPr>
-        <w:t>, SQL)</w:t>
+        <w:t>Анализ влияния факторов на ценообразование на рынке недвижимости (Python, Statsmodels, SQL)</w:t>
       </w:r>
     </w:p>
     <w:p>
@@ -109,15 +69,7 @@
           <w:sz w:val="28"/>
           <w:szCs w:val="28"/>
         </w:rPr>
-        <w:t xml:space="preserve"> </w:t>
-      </w:r>
-      <w:r>
-        <w:rPr>
-          <w:color w:val="0F1115"/>
-          <w:sz w:val="28"/>
-          <w:szCs w:val="28"/>
-        </w:rPr>
-        <w:t>состояла в выявлении ключевых факторов, определяющих стоимость объектов недвижимости, и построении статистической модели, позволяющей прогнозировать цены на основе доступных характеристик. Особый интерес представляло разделение действительно значимых факторов и тех, влияние которых статистически не подтверждается, чтобы дать обоснованные рекомендации для покупателей, продавцов и инвесторов. Дополнительной целью являлась проверка устойчивости оценок к нарушению предположений классической регрессии и коррекция стандартных ошибок.</w:t>
+        <w:t xml:space="preserve"> состояла в выявлении ключевых факторов, определяющих стоимость объектов недвижимости, и построении статистической модели, позволяющей прогнозировать цены на основе доступных характеристик. Особый интерес представляло разделение действительно значимых факторов и тех, влияние которых статистически не подтверждается, чтобы дать обоснованные рекомендации для покупателей, продавцов и инвесторов. Дополнительной целью являлась проверка устойчивости оценок к нарушению предположений классической регрессии и коррекция стандартных ошибок.</w:t>
       </w:r>
     </w:p>
     <w:p>
@@ -143,41 +95,13 @@
         </w:rPr>
         <w:t xml:space="preserve">Данные </w:t>
       </w:r>
-      <w:proofErr w:type="spellStart"/>
-      <w:r>
-        <w:rPr>
-          <w:color w:val="0F1115"/>
-          <w:sz w:val="28"/>
-          <w:szCs w:val="28"/>
-        </w:rPr>
-        <w:t>редставляли</w:t>
-      </w:r>
-      <w:proofErr w:type="spellEnd"/>
-      <w:r>
-        <w:rPr>
-          <w:color w:val="0F1115"/>
-          <w:sz w:val="28"/>
-          <w:szCs w:val="28"/>
-        </w:rPr>
-        <w:t xml:space="preserve"> собой </w:t>
-      </w:r>
-      <w:proofErr w:type="spellStart"/>
-      <w:r>
-        <w:rPr>
-          <w:color w:val="0F1115"/>
-          <w:sz w:val="28"/>
-          <w:szCs w:val="28"/>
-        </w:rPr>
-        <w:t>датасет</w:t>
-      </w:r>
-      <w:proofErr w:type="spellEnd"/>
-      <w:r>
-        <w:rPr>
-          <w:color w:val="0F1115"/>
-          <w:sz w:val="28"/>
-          <w:szCs w:val="28"/>
-        </w:rPr>
-        <w:t>, содержащий </w:t>
+      <w:r>
+        <w:rPr>
+          <w:color w:val="0F1115"/>
+          <w:sz w:val="28"/>
+          <w:szCs w:val="28"/>
+        </w:rPr>
+        <w:t>редставляли собой датасет, содержащий </w:t>
       </w:r>
       <w:r>
         <w:rPr>
@@ -195,43 +119,7 @@
           <w:sz w:val="28"/>
           <w:szCs w:val="28"/>
         </w:rPr>
-        <w:t xml:space="preserve"> по объектам недвижимости, включающий следующие переменные: тип собственности (отдельный дом, </w:t>
-      </w:r>
-      <w:proofErr w:type="spellStart"/>
-      <w:r>
-        <w:rPr>
-          <w:color w:val="0F1115"/>
-          <w:sz w:val="28"/>
-          <w:szCs w:val="28"/>
-        </w:rPr>
-        <w:t>кондо</w:t>
-      </w:r>
-      <w:proofErr w:type="spellEnd"/>
-      <w:r>
-        <w:rPr>
-          <w:color w:val="0F1115"/>
-          <w:sz w:val="28"/>
-          <w:szCs w:val="28"/>
-        </w:rPr>
-        <w:t xml:space="preserve">, </w:t>
-      </w:r>
-      <w:proofErr w:type="spellStart"/>
-      <w:r>
-        <w:rPr>
-          <w:color w:val="0F1115"/>
-          <w:sz w:val="28"/>
-          <w:szCs w:val="28"/>
-        </w:rPr>
-        <w:t>таунхаус</w:t>
-      </w:r>
-      <w:proofErr w:type="spellEnd"/>
-      <w:r>
-        <w:rPr>
-          <w:color w:val="0F1115"/>
-          <w:sz w:val="28"/>
-          <w:szCs w:val="28"/>
-        </w:rPr>
-        <w:t>, квартира), наличие гаража (бинарный признак), жилая площадь в квадратных метрах, площадь земельного участка в квадратных метрах, возраст здания в годах и итоговая цена продажи в долларах США. Все записи были полными, пропуски отсутствовали, что позволило сразу перейти к анализу без дополнительной очистки.</w:t>
+        <w:t> по объектам недвижимости, включающий следующие переменные: тип собственности (отдельный дом, кондо, таунхаус, квартира), наличие гаража (бинарный признак), жилая площадь в квадратных метрах, площадь земельного участка в квадратных метрах, возраст здания в годах и итоговая цена продажи в долларах США. Все записи были полными, пропуски отсутствовали, что позволило сразу перейти к анализу без дополнительной очистки.</w:t>
       </w:r>
     </w:p>
     <w:p>
@@ -263,15 +151,7 @@
           <w:sz w:val="28"/>
           <w:szCs w:val="28"/>
         </w:rPr>
-        <w:t xml:space="preserve"> </w:t>
-      </w:r>
-      <w:r>
-        <w:rPr>
-          <w:color w:val="0F1115"/>
-          <w:sz w:val="28"/>
-          <w:szCs w:val="28"/>
-        </w:rPr>
-        <w:t>я выполнил последовательные этапы. На первом этапе я создал столбец с натуральным логарифмом цены (</w:t>
+        <w:t xml:space="preserve"> я выполнил последовательные этапы. На первом этапе я создал столбец с натуральным логарифмом цены (</w:t>
       </w:r>
       <w:r>
         <w:rPr>
@@ -500,61 +380,7 @@
           <w:sz w:val="28"/>
           <w:szCs w:val="28"/>
         </w:rPr>
-        <w:t xml:space="preserve">, что указывало на </w:t>
-      </w:r>
-      <w:proofErr w:type="spellStart"/>
-      <w:r>
-        <w:rPr>
-          <w:color w:val="0F1115"/>
-          <w:sz w:val="28"/>
-          <w:szCs w:val="28"/>
-        </w:rPr>
-        <w:t>мультиколлинеарность</w:t>
-      </w:r>
-      <w:proofErr w:type="spellEnd"/>
-      <w:r>
-        <w:rPr>
-          <w:color w:val="0F1115"/>
-          <w:sz w:val="28"/>
-          <w:szCs w:val="28"/>
-        </w:rPr>
-        <w:t xml:space="preserve"> — дублирование информации между признаками. На основе этого я принял решение исключить площадь участка из модели, так как она не добавляла новой информации, а только создавала избыточность. После этого я построил множественную линейную регрессию с логарифмированной ценой в качестве зависимой переменной и следующими предикторами: три бинарные переменные для типов недвижимости (</w:t>
-      </w:r>
-      <w:proofErr w:type="spellStart"/>
-      <w:r>
-        <w:rPr>
-          <w:color w:val="0F1115"/>
-          <w:sz w:val="28"/>
-          <w:szCs w:val="28"/>
-        </w:rPr>
-        <w:t>кондо</w:t>
-      </w:r>
-      <w:proofErr w:type="spellEnd"/>
-      <w:r>
-        <w:rPr>
-          <w:color w:val="0F1115"/>
-          <w:sz w:val="28"/>
-          <w:szCs w:val="28"/>
-        </w:rPr>
-        <w:t xml:space="preserve">, </w:t>
-      </w:r>
-      <w:proofErr w:type="spellStart"/>
-      <w:r>
-        <w:rPr>
-          <w:color w:val="0F1115"/>
-          <w:sz w:val="28"/>
-          <w:szCs w:val="28"/>
-        </w:rPr>
-        <w:t>таунхаус</w:t>
-      </w:r>
-      <w:proofErr w:type="spellEnd"/>
-      <w:r>
-        <w:rPr>
-          <w:color w:val="0F1115"/>
-          <w:sz w:val="28"/>
-          <w:szCs w:val="28"/>
-        </w:rPr>
-        <w:t>, квартира), при этом базовым уровнем был выбран отдельный дом; наличие гаража; жилая площадь; возраст здания.</w:t>
+        <w:t>, что указывало на мультиколлинеарность — дублирование информации между признаками. На основе этого я принял решение исключить площадь участка из модели, так как она не добавляла новой информации, а только создавала избыточность. После этого я построил множественную линейную регрессию с логарифмированной ценой в качестве зависимой переменной и следующими предикторами: три бинарные переменные для типов недвижимости (кондо, таунхаус, квартира), при этом базовым уровнем был выбран отдельный дом; наличие гаража; жилая площадь; возраст здания.</w:t>
       </w:r>
     </w:p>
     <w:p>
@@ -686,6 +512,16 @@
         </w:rPr>
         <w:t>, что подтверждает отсутствие переобучения.</w:t>
       </w:r>
+      <w:r>
+        <w:rPr>
+          <w:color w:val="0F1115"/>
+          <w:sz w:val="28"/>
+          <w:szCs w:val="28"/>
+        </w:rPr>
+        <w:t xml:space="preserve"> </w:t>
+      </w:r>
+      <w:bookmarkStart w:id="0" w:name="_GoBack"/>
+      <w:bookmarkEnd w:id="0"/>
     </w:p>
     <w:p>
       <w:pPr>
@@ -778,25 +614,7 @@
           <w:sz w:val="28"/>
           <w:szCs w:val="28"/>
         </w:rPr>
-        <w:t xml:space="preserve">Анализ отдельных коэффициентов (с использованием робастных стандартных ошибок HC3 для коррекции </w:t>
-      </w:r>
-      <w:proofErr w:type="spellStart"/>
-      <w:r>
-        <w:rPr>
-          <w:color w:val="0F1115"/>
-          <w:sz w:val="28"/>
-          <w:szCs w:val="28"/>
-        </w:rPr>
-        <w:t>гетероскедастичности</w:t>
-      </w:r>
-      <w:proofErr w:type="spellEnd"/>
-      <w:r>
-        <w:rPr>
-          <w:color w:val="0F1115"/>
-          <w:sz w:val="28"/>
-          <w:szCs w:val="28"/>
-        </w:rPr>
-        <w:t>) показал:</w:t>
+        <w:t>Анализ отдельных коэффициентов (с использованием робастных стандартных ошибок HC3 для коррекции гетероскедастичности) показал:</w:t>
       </w:r>
     </w:p>
     <w:p>
@@ -858,25 +676,7 @@
           <w:sz w:val="28"/>
           <w:szCs w:val="28"/>
         </w:rPr>
-        <w:t xml:space="preserve">, p </w:t>
-      </w:r>
-      <w:proofErr w:type="gramStart"/>
-      <w:r>
-        <w:rPr>
-          <w:color w:val="0F1115"/>
-          <w:sz w:val="28"/>
-          <w:szCs w:val="28"/>
-        </w:rPr>
-        <w:t>&lt; 0,001</w:t>
-      </w:r>
-      <w:proofErr w:type="gramEnd"/>
-      <w:r>
-        <w:rPr>
-          <w:color w:val="0F1115"/>
-          <w:sz w:val="28"/>
-          <w:szCs w:val="28"/>
-        </w:rPr>
-        <w:t>, стандартная ошибка </w:t>
+        <w:t>, p &lt; 0,001, стандартная ошибка </w:t>
       </w:r>
       <w:r>
         <w:rPr>
@@ -974,25 +774,7 @@
           <w:sz w:val="28"/>
           <w:szCs w:val="28"/>
         </w:rPr>
-        <w:t xml:space="preserve">, p </w:t>
-      </w:r>
-      <w:proofErr w:type="gramStart"/>
-      <w:r>
-        <w:rPr>
-          <w:color w:val="0F1115"/>
-          <w:sz w:val="28"/>
-          <w:szCs w:val="28"/>
-        </w:rPr>
-        <w:t>&lt; 0,001</w:t>
-      </w:r>
-      <w:proofErr w:type="gramEnd"/>
-      <w:r>
-        <w:rPr>
-          <w:color w:val="0F1115"/>
-          <w:sz w:val="28"/>
-          <w:szCs w:val="28"/>
-        </w:rPr>
-        <w:t>, ст. ошибка </w:t>
+        <w:t>, p &lt; 0,001, ст. ошибка </w:t>
       </w:r>
       <w:r>
         <w:rPr>
@@ -1030,7 +812,6 @@
           <w:szCs w:val="28"/>
         </w:rPr>
       </w:pPr>
-      <w:proofErr w:type="spellStart"/>
       <w:r>
         <w:rPr>
           <w:rStyle w:val="a3"/>
@@ -1041,7 +822,6 @@
         </w:rPr>
         <w:t>кондо</w:t>
       </w:r>
-      <w:proofErr w:type="spellEnd"/>
       <w:r>
         <w:rPr>
           <w:color w:val="0F1115"/>
@@ -1084,25 +864,7 @@
           <w:sz w:val="28"/>
           <w:szCs w:val="28"/>
         </w:rPr>
-        <w:t xml:space="preserve">, p </w:t>
-      </w:r>
-      <w:proofErr w:type="gramStart"/>
-      <w:r>
-        <w:rPr>
-          <w:color w:val="0F1115"/>
-          <w:sz w:val="28"/>
-          <w:szCs w:val="28"/>
-        </w:rPr>
-        <w:t>&lt; 0,001</w:t>
-      </w:r>
-      <w:proofErr w:type="gramEnd"/>
-      <w:r>
-        <w:rPr>
-          <w:color w:val="0F1115"/>
-          <w:sz w:val="28"/>
-          <w:szCs w:val="28"/>
-        </w:rPr>
-        <w:t>, ст. ошибка </w:t>
+        <w:t>, p &lt; 0,001, ст. ошибка </w:t>
       </w:r>
       <w:r>
         <w:rPr>
@@ -1140,7 +902,6 @@
           <w:szCs w:val="28"/>
         </w:rPr>
       </w:pPr>
-      <w:proofErr w:type="spellStart"/>
       <w:r>
         <w:rPr>
           <w:rStyle w:val="a3"/>
@@ -1152,7 +913,6 @@
         <w:lastRenderedPageBreak/>
         <w:t>таунхаусы</w:t>
       </w:r>
-      <w:proofErr w:type="spellEnd"/>
       <w:r>
         <w:rPr>
           <w:color w:val="0F1115"/>
@@ -1195,25 +955,7 @@
           <w:sz w:val="28"/>
           <w:szCs w:val="28"/>
         </w:rPr>
-        <w:t xml:space="preserve">, p </w:t>
-      </w:r>
-      <w:proofErr w:type="gramStart"/>
-      <w:r>
-        <w:rPr>
-          <w:color w:val="0F1115"/>
-          <w:sz w:val="28"/>
-          <w:szCs w:val="28"/>
-        </w:rPr>
-        <w:t>&lt; 0,001</w:t>
-      </w:r>
-      <w:proofErr w:type="gramEnd"/>
-      <w:r>
-        <w:rPr>
-          <w:color w:val="0F1115"/>
-          <w:sz w:val="28"/>
-          <w:szCs w:val="28"/>
-        </w:rPr>
-        <w:t>, ст. ошибка </w:t>
+        <w:t>, p &lt; 0,001, ст. ошибка </w:t>
       </w:r>
       <w:r>
         <w:rPr>
@@ -1293,25 +1035,7 @@
           <w:sz w:val="28"/>
           <w:szCs w:val="28"/>
         </w:rPr>
-        <w:t xml:space="preserve">, p </w:t>
-      </w:r>
-      <w:proofErr w:type="gramStart"/>
-      <w:r>
-        <w:rPr>
-          <w:color w:val="0F1115"/>
-          <w:sz w:val="28"/>
-          <w:szCs w:val="28"/>
-        </w:rPr>
-        <w:t>&lt; 0,001</w:t>
-      </w:r>
-      <w:proofErr w:type="gramEnd"/>
-      <w:r>
-        <w:rPr>
-          <w:color w:val="0F1115"/>
-          <w:sz w:val="28"/>
-          <w:szCs w:val="28"/>
-        </w:rPr>
-        <w:t>, ст. ошибка </w:t>
+        <w:t>, p &lt; 0,001, ст. ошибка </w:t>
       </w:r>
       <w:r>
         <w:rPr>
@@ -1405,15 +1129,7 @@
           <w:sz w:val="28"/>
           <w:szCs w:val="28"/>
         </w:rPr>
-        <w:t xml:space="preserve"> </w:t>
-      </w:r>
-      <w:r>
-        <w:rPr>
-          <w:color w:val="0F1115"/>
-          <w:sz w:val="28"/>
-          <w:szCs w:val="28"/>
-        </w:rPr>
-        <w:t>включала проверку стандартных предположений.</w:t>
+        <w:t xml:space="preserve"> включала проверку стандартных предположений.</w:t>
       </w:r>
     </w:p>
     <w:p>
@@ -1441,20 +1157,8 @@
           <w:sz w:val="28"/>
           <w:szCs w:val="28"/>
         </w:rPr>
-        <w:t xml:space="preserve">Тест </w:t>
-      </w:r>
-      <w:proofErr w:type="spellStart"/>
-      <w:r>
-        <w:rPr>
-          <w:rStyle w:val="a3"/>
-          <w:b w:val="0"/>
-          <w:color w:val="0F1115"/>
-          <w:sz w:val="28"/>
-          <w:szCs w:val="28"/>
-        </w:rPr>
-        <w:t>Бройша-Пагана</w:t>
-      </w:r>
-      <w:proofErr w:type="spellEnd"/>
+        <w:t>Тест Бройша-Пагана</w:t>
+      </w:r>
       <w:r>
         <w:rPr>
           <w:color w:val="0F1115"/>
@@ -1479,25 +1183,7 @@
           <w:sz w:val="28"/>
           <w:szCs w:val="28"/>
         </w:rPr>
-        <w:t xml:space="preserve">, что свидетельствует о наличии </w:t>
-      </w:r>
-      <w:proofErr w:type="spellStart"/>
-      <w:r>
-        <w:rPr>
-          <w:color w:val="0F1115"/>
-          <w:sz w:val="28"/>
-          <w:szCs w:val="28"/>
-        </w:rPr>
-        <w:t>гетероскедастичности</w:t>
-      </w:r>
-      <w:proofErr w:type="spellEnd"/>
-      <w:r>
-        <w:rPr>
-          <w:color w:val="0F1115"/>
-          <w:sz w:val="28"/>
-          <w:szCs w:val="28"/>
-        </w:rPr>
-        <w:t xml:space="preserve"> — ошибки модели имеют непостоянную дисперсию. Чтобы получить корректные оценки значимости, я применил </w:t>
+        <w:t>, что свидетельствует о наличии гетероскедастичности — ошибки модели имеют непостоянную дисперсию. Чтобы получить корректные оценки значимости, я применил </w:t>
       </w:r>
       <w:r>
         <w:rPr>
@@ -1515,25 +1201,7 @@
           <w:sz w:val="28"/>
           <w:szCs w:val="28"/>
         </w:rPr>
-        <w:t>, что позволило сделать выводы надёжными даже при нарушении предположения. Сравнение обычных и робастных ошибок показало увеличение стандартных ошибок для некоторых коэффициентов (например, для «</w:t>
-      </w:r>
-      <w:proofErr w:type="spellStart"/>
-      <w:r>
-        <w:rPr>
-          <w:color w:val="0F1115"/>
-          <w:sz w:val="28"/>
-          <w:szCs w:val="28"/>
-        </w:rPr>
-        <w:t>кондо</w:t>
-      </w:r>
-      <w:proofErr w:type="spellEnd"/>
-      <w:r>
-        <w:rPr>
-          <w:color w:val="0F1115"/>
-          <w:sz w:val="28"/>
-          <w:szCs w:val="28"/>
-        </w:rPr>
-        <w:t>» на 17%, для «квартиры» на 6%), что привело к незначимости гаража на 5%-ном уровне.</w:t>
+        <w:t>, что позволило сделать выводы надёжными даже при нарушении предположения. Сравнение обычных и робастных ошибок показало увеличение стандартных ошибок для некоторых коэффициентов (например, для «кондо» на 17%, для «квартиры» на 6%), что привело к незначимости гаража на 5%-ном уровне.</w:t>
       </w:r>
     </w:p>
     <w:p>
@@ -1561,35 +1229,15 @@
           <w:sz w:val="28"/>
           <w:szCs w:val="28"/>
         </w:rPr>
-        <w:t xml:space="preserve">Анализ </w:t>
-      </w:r>
-      <w:proofErr w:type="spellStart"/>
-      <w:r>
-        <w:rPr>
-          <w:rStyle w:val="a3"/>
-          <w:b w:val="0"/>
-          <w:color w:val="0F1115"/>
-          <w:sz w:val="28"/>
-          <w:szCs w:val="28"/>
-        </w:rPr>
-        <w:t>мультиколлинеарности</w:t>
-      </w:r>
-      <w:proofErr w:type="spellEnd"/>
-      <w:r>
-        <w:rPr>
-          <w:color w:val="0F1115"/>
-          <w:sz w:val="28"/>
-          <w:szCs w:val="28"/>
-        </w:rPr>
-        <w:t xml:space="preserve"> </w:t>
-      </w:r>
-      <w:r>
-        <w:rPr>
-          <w:color w:val="0F1115"/>
-          <w:sz w:val="28"/>
-          <w:szCs w:val="28"/>
-        </w:rPr>
-        <w:t>с помощью </w:t>
+        <w:t>Анализ мультиколлинеарности</w:t>
+      </w:r>
+      <w:r>
+        <w:rPr>
+          <w:color w:val="0F1115"/>
+          <w:sz w:val="28"/>
+          <w:szCs w:val="28"/>
+        </w:rPr>
+        <w:t xml:space="preserve"> с помощью </w:t>
       </w:r>
       <w:r>
         <w:rPr>
@@ -1607,25 +1255,7 @@
           <w:sz w:val="28"/>
           <w:szCs w:val="28"/>
         </w:rPr>
-        <w:t xml:space="preserve"> показал, что все признаки имеют значения значительно ниже порога 10: для </w:t>
-      </w:r>
-      <w:proofErr w:type="spellStart"/>
-      <w:r>
-        <w:rPr>
-          <w:color w:val="0F1115"/>
-          <w:sz w:val="28"/>
-          <w:szCs w:val="28"/>
-        </w:rPr>
-        <w:t>кондо</w:t>
-      </w:r>
-      <w:proofErr w:type="spellEnd"/>
-      <w:r>
-        <w:rPr>
-          <w:color w:val="0F1115"/>
-          <w:sz w:val="28"/>
-          <w:szCs w:val="28"/>
-        </w:rPr>
-        <w:t xml:space="preserve"> — </w:t>
+        <w:t> показал, что все признаки имеют значения значительно ниже порога 10: для кондо — </w:t>
       </w:r>
       <w:r>
         <w:rPr>
@@ -1643,25 +1273,7 @@
           <w:sz w:val="28"/>
           <w:szCs w:val="28"/>
         </w:rPr>
-        <w:t xml:space="preserve">, для </w:t>
-      </w:r>
-      <w:proofErr w:type="spellStart"/>
-      <w:r>
-        <w:rPr>
-          <w:color w:val="0F1115"/>
-          <w:sz w:val="28"/>
-          <w:szCs w:val="28"/>
-        </w:rPr>
-        <w:t>таунхауса</w:t>
-      </w:r>
-      <w:proofErr w:type="spellEnd"/>
-      <w:r>
-        <w:rPr>
-          <w:color w:val="0F1115"/>
-          <w:sz w:val="28"/>
-          <w:szCs w:val="28"/>
-        </w:rPr>
-        <w:t xml:space="preserve"> — </w:t>
+        <w:t>, для таунхауса — </w:t>
       </w:r>
       <w:r>
         <w:rPr>
@@ -1751,25 +1363,7 @@
           <w:sz w:val="28"/>
           <w:szCs w:val="28"/>
         </w:rPr>
-        <w:t xml:space="preserve">. Это подтверждает, что после исключения площади участка </w:t>
-      </w:r>
-      <w:proofErr w:type="spellStart"/>
-      <w:r>
-        <w:rPr>
-          <w:color w:val="0F1115"/>
-          <w:sz w:val="28"/>
-          <w:szCs w:val="28"/>
-        </w:rPr>
-        <w:t>мультиколлинеарность</w:t>
-      </w:r>
-      <w:proofErr w:type="spellEnd"/>
-      <w:r>
-        <w:rPr>
-          <w:color w:val="0F1115"/>
-          <w:sz w:val="28"/>
-          <w:szCs w:val="28"/>
-        </w:rPr>
-        <w:t xml:space="preserve"> отсутствует.</w:t>
+        <w:t>. Это подтверждает, что после исключения площади участка мультиколлинеарность отсутствует.</w:t>
       </w:r>
     </w:p>
     <w:p>
@@ -1805,87 +1399,7 @@
           <w:sz w:val="28"/>
           <w:szCs w:val="28"/>
         </w:rPr>
-        <w:t xml:space="preserve"> </w:t>
-      </w:r>
-      <w:r>
-        <w:rPr>
-          <w:color w:val="0F1115"/>
-          <w:sz w:val="28"/>
-          <w:szCs w:val="28"/>
-        </w:rPr>
-        <w:t>(график зависимости остатков от предсказанных значений, QQ-</w:t>
-      </w:r>
-      <w:proofErr w:type="spellStart"/>
-      <w:r>
-        <w:rPr>
-          <w:color w:val="0F1115"/>
-          <w:sz w:val="28"/>
-          <w:szCs w:val="28"/>
-        </w:rPr>
-        <w:t>plot</w:t>
-      </w:r>
-      <w:proofErr w:type="spellEnd"/>
-      <w:r>
-        <w:rPr>
-          <w:color w:val="0F1115"/>
-          <w:sz w:val="28"/>
-          <w:szCs w:val="28"/>
-        </w:rPr>
-        <w:t>, гистограмма) подтвердила адекватность модели: остатки случайно разбросаны вокруг нулевой линии без видимых закономерностей, их распределение близко к нормальному (хотя QQ-</w:t>
-      </w:r>
-      <w:proofErr w:type="spellStart"/>
-      <w:r>
-        <w:rPr>
-          <w:color w:val="0F1115"/>
-          <w:sz w:val="28"/>
-          <w:szCs w:val="28"/>
-        </w:rPr>
-        <w:t>plot</w:t>
-      </w:r>
-      <w:proofErr w:type="spellEnd"/>
-      <w:r>
-        <w:rPr>
-          <w:color w:val="0F1115"/>
-          <w:sz w:val="28"/>
-          <w:szCs w:val="28"/>
-        </w:rPr>
-        <w:t xml:space="preserve"> показывает некоторое отклонение на хвостах, что связано с </w:t>
-      </w:r>
-      <w:proofErr w:type="spellStart"/>
-      <w:r>
-        <w:rPr>
-          <w:color w:val="0F1115"/>
-          <w:sz w:val="28"/>
-          <w:szCs w:val="28"/>
-        </w:rPr>
-        <w:t>гетероскедастичностью</w:t>
-      </w:r>
-      <w:proofErr w:type="spellEnd"/>
-      <w:r>
-        <w:rPr>
-          <w:color w:val="0F1115"/>
-          <w:sz w:val="28"/>
-          <w:szCs w:val="28"/>
-        </w:rPr>
-        <w:t xml:space="preserve">), а фактические цены хорошо согласуются с предсказанными — точки на графике фактических </w:t>
-      </w:r>
-      <w:proofErr w:type="spellStart"/>
-      <w:r>
-        <w:rPr>
-          <w:color w:val="0F1115"/>
-          <w:sz w:val="28"/>
-          <w:szCs w:val="28"/>
-        </w:rPr>
-        <w:t>vs</w:t>
-      </w:r>
-      <w:proofErr w:type="spellEnd"/>
-      <w:r>
-        <w:rPr>
-          <w:color w:val="0F1115"/>
-          <w:sz w:val="28"/>
-          <w:szCs w:val="28"/>
-        </w:rPr>
-        <w:t xml:space="preserve"> предсказанных лежат близко к диагонали.</w:t>
+        <w:t xml:space="preserve"> (график зависимости остатков от предсказанных значений, QQ-plot, гистограмма) подтвердила адекватность модели: остатки случайно разбросаны вокруг нулевой линии без видимых закономерностей, их распределение близко к нормальному (хотя QQ-plot показывает некоторое отклонение на хвостах, что связано с гетероскедастичностью), а фактические цены хорошо согласуются с предсказанными — точки на графике фактических vs предсказанных лежат близко к диагонали.</w:t>
       </w:r>
     </w:p>
     <w:p>
@@ -1918,50 +1432,18 @@
           <w:sz w:val="28"/>
           <w:szCs w:val="28"/>
         </w:rPr>
-        <w:t xml:space="preserve"> </w:t>
-      </w:r>
-      <w:r>
-        <w:rPr>
-          <w:color w:val="0F1115"/>
-          <w:sz w:val="28"/>
-          <w:szCs w:val="28"/>
-        </w:rPr>
-        <w:t>для выполнения всех расчётов служила среда </w:t>
-      </w:r>
-      <w:proofErr w:type="spellStart"/>
-      <w:r>
-        <w:rPr>
-          <w:rStyle w:val="a3"/>
-          <w:b w:val="0"/>
-          <w:color w:val="0F1115"/>
-          <w:sz w:val="28"/>
-          <w:szCs w:val="28"/>
-        </w:rPr>
-        <w:t>Jupyter</w:t>
-      </w:r>
-      <w:proofErr w:type="spellEnd"/>
-      <w:r>
-        <w:rPr>
-          <w:rStyle w:val="a3"/>
-          <w:b w:val="0"/>
-          <w:color w:val="0F1115"/>
-          <w:sz w:val="28"/>
-          <w:szCs w:val="28"/>
-        </w:rPr>
-        <w:t xml:space="preserve"> </w:t>
-      </w:r>
-      <w:proofErr w:type="spellStart"/>
-      <w:r>
-        <w:rPr>
-          <w:rStyle w:val="a3"/>
-          <w:b w:val="0"/>
-          <w:color w:val="0F1115"/>
-          <w:sz w:val="28"/>
-          <w:szCs w:val="28"/>
-        </w:rPr>
-        <w:t>Notebook</w:t>
-      </w:r>
-      <w:proofErr w:type="spellEnd"/>
+        <w:t xml:space="preserve"> для выполнения всех расчётов служила среда </w:t>
+      </w:r>
+      <w:r>
+        <w:rPr>
+          <w:rStyle w:val="a3"/>
+          <w:b w:val="0"/>
+          <w:color w:val="0F1115"/>
+          <w:sz w:val="28"/>
+          <w:szCs w:val="28"/>
+        </w:rPr>
+        <w:t>Jupyter Notebook</w:t>
+      </w:r>
       <w:r>
         <w:rPr>
           <w:color w:val="0F1115"/>
@@ -1970,7 +1452,6 @@
         </w:rPr>
         <w:t> с языком </w:t>
       </w:r>
-      <w:proofErr w:type="spellStart"/>
       <w:r>
         <w:rPr>
           <w:rStyle w:val="a3"/>
@@ -1981,7 +1462,6 @@
         </w:rPr>
         <w:t>Python</w:t>
       </w:r>
-      <w:proofErr w:type="spellEnd"/>
       <w:r>
         <w:rPr>
           <w:color w:val="0F1115"/>
@@ -1990,7 +1470,6 @@
         </w:rPr>
         <w:t>. Для загрузки и обработки данных использовалась библиотека </w:t>
       </w:r>
-      <w:proofErr w:type="spellStart"/>
       <w:r>
         <w:rPr>
           <w:rStyle w:val="a3"/>
@@ -2001,7 +1480,6 @@
         </w:rPr>
         <w:t>Pandas</w:t>
       </w:r>
-      <w:proofErr w:type="spellEnd"/>
       <w:r>
         <w:rPr>
           <w:color w:val="0F1115"/>
@@ -2010,7 +1488,6 @@
         </w:rPr>
         <w:t>, для математических вычислений — </w:t>
       </w:r>
-      <w:proofErr w:type="spellStart"/>
       <w:r>
         <w:rPr>
           <w:rStyle w:val="a3"/>
@@ -2021,7 +1498,6 @@
         </w:rPr>
         <w:t>NumPy</w:t>
       </w:r>
-      <w:proofErr w:type="spellEnd"/>
       <w:r>
         <w:rPr>
           <w:color w:val="0F1115"/>
@@ -2030,7 +1506,6 @@
         </w:rPr>
         <w:t>, для визуализации — </w:t>
       </w:r>
-      <w:proofErr w:type="spellStart"/>
       <w:r>
         <w:rPr>
           <w:rStyle w:val="a3"/>
@@ -2041,7 +1516,6 @@
         </w:rPr>
         <w:t>Seaborn</w:t>
       </w:r>
-      <w:proofErr w:type="spellEnd"/>
       <w:r>
         <w:rPr>
           <w:color w:val="0F1115"/>
@@ -2050,7 +1524,6 @@
         </w:rPr>
         <w:t> и </w:t>
       </w:r>
-      <w:proofErr w:type="spellStart"/>
       <w:r>
         <w:rPr>
           <w:rStyle w:val="a3"/>
@@ -2061,34 +1534,14 @@
         </w:rPr>
         <w:t>Matplotlib</w:t>
       </w:r>
-      <w:proofErr w:type="spellEnd"/>
-      <w:r>
-        <w:rPr>
-          <w:color w:val="0F1115"/>
-          <w:sz w:val="28"/>
-          <w:szCs w:val="28"/>
-        </w:rPr>
-        <w:t xml:space="preserve">. Регрессионная модель и статистические тесты (включая тест </w:t>
-      </w:r>
-      <w:proofErr w:type="spellStart"/>
-      <w:r>
-        <w:rPr>
-          <w:color w:val="0F1115"/>
-          <w:sz w:val="28"/>
-          <w:szCs w:val="28"/>
-        </w:rPr>
-        <w:t>Бройша-Пагана</w:t>
-      </w:r>
-      <w:proofErr w:type="spellEnd"/>
-      <w:r>
-        <w:rPr>
-          <w:color w:val="0F1115"/>
-          <w:sz w:val="28"/>
-          <w:szCs w:val="28"/>
-        </w:rPr>
-        <w:t>, VIF, робастные стандартные ошибки) были реализованы с помощью </w:t>
-      </w:r>
-      <w:proofErr w:type="spellStart"/>
+      <w:r>
+        <w:rPr>
+          <w:color w:val="0F1115"/>
+          <w:sz w:val="28"/>
+          <w:szCs w:val="28"/>
+        </w:rPr>
+        <w:t>. Регрессионная модель и статистические тесты (включая тест Бройша-Пагана, VIF, робастные стандартные ошибки) были реализованы с помощью </w:t>
+      </w:r>
       <w:r>
         <w:rPr>
           <w:rStyle w:val="a3"/>
@@ -2099,7 +1552,6 @@
         </w:rPr>
         <w:t>Statsmodels</w:t>
       </w:r>
-      <w:proofErr w:type="spellEnd"/>
       <w:r>
         <w:rPr>
           <w:color w:val="0F1115"/>
@@ -2108,7 +1560,6 @@
         </w:rPr>
         <w:t>, а дополнительные проверки — с использованием </w:t>
       </w:r>
-      <w:proofErr w:type="spellStart"/>
       <w:r>
         <w:rPr>
           <w:rStyle w:val="a3"/>
@@ -2119,7 +1570,6 @@
         </w:rPr>
         <w:t>Scipy</w:t>
       </w:r>
-      <w:proofErr w:type="spellEnd"/>
       <w:r>
         <w:rPr>
           <w:color w:val="0F1115"/>
@@ -2328,25 +1778,7 @@
           <w:sz w:val="28"/>
           <w:szCs w:val="28"/>
         </w:rPr>
-        <w:t xml:space="preserve"> дороже </w:t>
-      </w:r>
-      <w:proofErr w:type="spellStart"/>
-      <w:r>
-        <w:rPr>
-          <w:color w:val="0F1115"/>
-          <w:sz w:val="28"/>
-          <w:szCs w:val="28"/>
-        </w:rPr>
-        <w:t>кондо</w:t>
-      </w:r>
-      <w:proofErr w:type="spellEnd"/>
-      <w:r>
-        <w:rPr>
-          <w:color w:val="0F1115"/>
-          <w:sz w:val="28"/>
-          <w:szCs w:val="28"/>
-        </w:rPr>
-        <w:t xml:space="preserve"> и на </w:t>
+        <w:t> дороже кондо и на </w:t>
       </w:r>
       <w:r>
         <w:rPr>
@@ -2364,25 +1796,7 @@
           <w:sz w:val="28"/>
           <w:szCs w:val="28"/>
         </w:rPr>
-        <w:t xml:space="preserve"> дороже </w:t>
-      </w:r>
-      <w:proofErr w:type="spellStart"/>
-      <w:r>
-        <w:rPr>
-          <w:color w:val="0F1115"/>
-          <w:sz w:val="28"/>
-          <w:szCs w:val="28"/>
-        </w:rPr>
-        <w:t>таунхаусов</w:t>
-      </w:r>
-      <w:proofErr w:type="spellEnd"/>
-      <w:r>
-        <w:rPr>
-          <w:color w:val="0F1115"/>
-          <w:sz w:val="28"/>
-          <w:szCs w:val="28"/>
-        </w:rPr>
-        <w:t xml:space="preserve"> при одинаковой площади. Это означает, что при переходе от квартиры к дому цена увеличивается почти в 1,9 раза.</w:t>
+        <w:t> дороже таунхаусов при одинаковой площади. Это означает, что при переходе от квартиры к дому цена увеличивается почти в 1,9 раза.</w:t>
       </w:r>
     </w:p>
     <w:p>
@@ -2676,8 +2090,6 @@
           <w:lang w:eastAsia="ru-RU"/>
         </w:rPr>
       </w:pPr>
-      <w:bookmarkStart w:id="0" w:name="_GoBack"/>
-      <w:bookmarkEnd w:id="0"/>
       <w:r>
         <w:rPr>
           <w:rFonts w:ascii="Segoe UI" w:eastAsia="Times New Roman" w:hAnsi="Segoe UI" w:cs="Segoe UI"/>

</xml_diff>